<commit_message>
docs: sync public demo and guide features
</commit_message>
<xml_diff>
--- a/financial_rag_resume_materials.docx
+++ b/financial_rag_resume_materials.docx
@@ -318,7 +318,7 @@
           <w:sz w:val="24"/>
           <w:sz-cs w:val="24"/>
         </w:rPr>
-        <w:t xml:space="preserve">- 自动化测试基线：2026-08-18共55项通过。</w:t>
+        <w:t xml:space="preserve">- 自动化测试基线：2026-08-18共62项通过。</w:t>
       </w:r>
     </w:p>
     <w:p>
@@ -428,6 +428,28 @@
           <w:sz w:val="24"/>
           <w:sz-cs w:val="24"/>
         </w:rPr>
+        <w:t xml:space="preserve">7. HR难以快速理解项目能力：首屏展示5家公司、15份年报、225题和技术链路；增加“我能问什么”和真实财报结构导览，回答后继续展示已验证示例。</w:t>
+      </w:r>
+    </w:p>
+    <w:p>
+      <w:pPr/>
+      <w:r>
+        <w:rPr>
+          <w:rFonts w:ascii="Helvetica Light" w:hAnsi="Helvetica Light" w:cs="Helvetica Light"/>
+          <w:sz w:val="24"/>
+          <w:sz-cs w:val="24"/>
+        </w:rPr>
+        <w:t xml:space="preserve">8. 云端缺少本地索引：将Chroma、Chunk和页面JSONL打包为带SHA-256的GitHub Release资产，由Streamlit首次启动安全下载。</w:t>
+      </w:r>
+    </w:p>
+    <w:p>
+      <w:pPr/>
+      <w:r>
+        <w:rPr>
+          <w:rFonts w:ascii="Helvetica Light" w:hAnsi="Helvetica Light" w:cs="Helvetica Light"/>
+          <w:sz w:val="24"/>
+          <w:sz-cs w:val="24"/>
+        </w:rPr>
         <w:t xml:space="preserve"/>
       </w:r>
     </w:p>
@@ -494,7 +516,7 @@
           <w:sz w:val="24"/>
           <w:sz-cs w:val="24"/>
         </w:rPr>
-        <w:t xml:space="preserve">- 当前是本地桌面演示，尚无正式公网部署、Docker/CI/CD和系统并发压测。</w:t>
+        <w:t xml:space="preserve">- 已公开部署Streamlit Demo，但尚无生产级SLA、Docker/CI/CD、应用层限流和系统并发压测。</w:t>
       </w:r>
     </w:p>
     <w:p>
@@ -593,7 +615,73 @@
           <w:sz w:val="24"/>
           <w:sz-cs w:val="24"/>
         </w:rPr>
-        <w:t xml:space="preserve">优先完成干净环境一键启动、固定演示录屏、独立跨文档holdout、不可答题集、P50/P95延迟、API成本和并发压测；随后增加能力咨询、真实目录概览以及跨公司/跨年度比较。</w:t>
+        <w:t xml:space="preserve">优先为公开Demo增加额度保护和错误监控，并准备固定演示录屏；随后完成独立跨文档holdout、不可答题集、P50/P95延迟、API成本和并发压测，以及跨公司/跨年度比较。</w:t>
+      </w:r>
+    </w:p>
+    <w:p>
+      <w:pPr/>
+      <w:r>
+        <w:rPr>
+          <w:rFonts w:ascii="Helvetica Light" w:hAnsi="Helvetica Light" w:cs="Helvetica Light"/>
+          <w:sz w:val="24"/>
+          <w:sz-cs w:val="24"/>
+        </w:rPr>
+        <w:t xml:space="preserve"/>
+      </w:r>
+    </w:p>
+    <w:p>
+      <w:pPr/>
+      <w:r>
+        <w:rPr>
+          <w:rFonts w:ascii="Helvetica Light" w:hAnsi="Helvetica Light" w:cs="Helvetica Light"/>
+          <w:sz w:val="24"/>
+          <w:sz-cs w:val="24"/>
+        </w:rPr>
+        <w:t xml:space="preserve">八、在线体验</w:t>
+      </w:r>
+    </w:p>
+    <w:p>
+      <w:pPr/>
+      <w:r>
+        <w:rPr>
+          <w:rFonts w:ascii="Helvetica Light" w:hAnsi="Helvetica Light" w:cs="Helvetica Light"/>
+          <w:sz w:val="24"/>
+          <w:sz-cs w:val="24"/>
+        </w:rPr>
+        <w:t xml:space="preserve"/>
+      </w:r>
+    </w:p>
+    <w:p>
+      <w:pPr/>
+      <w:r>
+        <w:rPr>
+          <w:rFonts w:ascii="Helvetica Light" w:hAnsi="Helvetica Light" w:cs="Helvetica Light"/>
+          <w:sz w:val="24"/>
+          <w:sz-cs w:val="24"/>
+        </w:rPr>
+        <w:t xml:space="preserve">https://financial-rag-assistant-cspk5yuoqjq9a5mf6zx9hg.streamlit.app</w:t>
+      </w:r>
+    </w:p>
+    <w:p>
+      <w:pPr/>
+      <w:r>
+        <w:rPr>
+          <w:rFonts w:ascii="Helvetica Light" w:hAnsi="Helvetica Light" w:cs="Helvetica Light"/>
+          <w:sz w:val="24"/>
+          <w:sz-cs w:val="24"/>
+        </w:rPr>
+        <w:t xml:space="preserve"/>
+      </w:r>
+    </w:p>
+    <w:p>
+      <w:pPr/>
+      <w:r>
+        <w:rPr>
+          <w:rFonts w:ascii="Helvetica Light" w:hAnsi="Helvetica Light" w:cs="Helvetica Light"/>
+          <w:sz w:val="24"/>
+          <w:sz-cs w:val="24"/>
+        </w:rPr>
+        <w:t xml:space="preserve">当前Demo无需登录，支持15份报告选择、能力导览、真实财报结构、逐报告已验证示例、证据问答和PDF页码追溯。</w:t>
       </w:r>
     </w:p>
     <w:sectPr/>

</xml_diff>